<commit_message>
Rapport : parties documentation, tests, présentation et dépôt
Le script écrivait dans un dossier documents/ disparu, emportant avec lui
le logo D-CLIC de la couverture ; celui-ci est récupéré depuis le document
déjà rendu et la sortie revient à la racine du projet.

- couverture à l'intitulé de l'activité, date du 24/09/2026 ;
- trois objectifs ajoutés : documenter, vérifier, déposer ;
- partie 6 : tableau des sept fichiers de test et enseignements tirés,
  le compte passant de cinquante-cinq à soixante-seize tests ;
- partie 9 : la documentation, du README aux commentaires du code ;
- partie 10 : l'espace de dépôt, ce qui en est écarté et pourquoi ;
- partie 11 : le déroulé de la présentation.
</commit_message>
<xml_diff>
--- a/Rapport_Projet_Mekano_Afrika_GNAZOU_BERNARD.docx
+++ b/Rapport_Projet_Mekano_Afrika_GNAZOU_BERNARD.docx
@@ -164,7 +164,7 @@
           <w:i w:val="0"/>
           <w:sz w:val="26"/>
         </w:rPr>
-        <w:t>ACTIVITE : PROJET FINAL</w:t>
+        <w:t>ACTIVITE : PROJET FINAL - DOCUMENTATION, TESTS, PRESENTATION, DEPOT</w:t>
       </w:r>
     </w:p>
     <w:p>
@@ -415,7 +415,7 @@
           <w:i w:val="0"/>
           <w:sz w:val="24"/>
         </w:rPr>
-        <w:t>DATE : 19/09/2026</w:t>
+        <w:t>DATE : 24/09/2026</w:t>
       </w:r>
     </w:p>
     <w:p>
@@ -537,6 +537,42 @@
           <w:sz w:val="22"/>
         </w:rPr>
         <w:t>Tenir les contraintes d'un terrain réel : téléphones d'entrée de gamme, réseau instable, lecture en plein soleil.</w:t>
+      </w:r>
+    </w:p>
+    <w:p>
+      <w:pPr>
+        <w:pStyle w:val="ListBullet"/>
+        <w:spacing w:after="80"/>
+      </w:pPr>
+      <w:r>
+        <w:rPr>
+          <w:sz w:val="22"/>
+        </w:rPr>
+        <w:t>Documenter le projet pour qu'un lecteur extérieur puisse le reprendre : rôle de chaque couche, décisions techniques et leurs raisons, marche à suivre pour l'installer.</w:t>
+      </w:r>
+    </w:p>
+    <w:p>
+      <w:pPr>
+        <w:pStyle w:val="ListBullet"/>
+        <w:spacing w:after="80"/>
+      </w:pPr>
+      <w:r>
+        <w:rPr>
+          <w:sz w:val="22"/>
+        </w:rPr>
+        <w:t>Vérifier le résultat par une campagne de tests automatisés, et préparer la démonstration de l'application sur appareil réel.</w:t>
+      </w:r>
+    </w:p>
+    <w:p>
+      <w:pPr>
+        <w:pStyle w:val="ListBullet"/>
+        <w:spacing w:after="80"/>
+      </w:pPr>
+      <w:r>
+        <w:rPr>
+          <w:sz w:val="22"/>
+        </w:rPr>
+        <w:t>Placer le projet sous gestion de version et constituer l'espace de dépôt attendu à la remise.</w:t>
       </w:r>
     </w:p>
     <w:p>
@@ -2331,7 +2367,7 @@
           <w:color w:val="C00000"/>
           <w:sz w:val="32"/>
         </w:rPr>
-        <w:t>6. Règles de gestion et tests</w:t>
+        <w:t>6. Règles de gestion et campagne de tests</w:t>
       </w:r>
     </w:p>
     <w:p>
@@ -2345,7 +2381,7 @@
           <w:i w:val="0"/>
           <w:sz w:val="22"/>
         </w:rPr>
-        <w:t>Les règles qui touchent au prix sont celles que l'utilisateur remarque immédiatement : elles sont donc couvertes par des tests automatisés. Cinquante-cinq tests sont exécutés, tous au vert.</w:t>
+        <w:t>Les règles qui touchent au prix sont celles que l'utilisateur remarque immédiatement : elles sont donc couvertes par des tests automatisés. La campagne compte soixante-seize tests, répartis en sept fichiers, tous au vert à la dernière exécution.</w:t>
       </w:r>
     </w:p>
     <w:tbl>
@@ -2700,6 +2736,440 @@
     <w:p/>
     <w:p>
       <w:pPr>
+        <w:spacing w:before="240" w:after="160"/>
+        <w:jc w:val="left"/>
+      </w:pPr>
+      <w:r>
+        <w:rPr>
+          <w:b/>
+          <w:i w:val="0"/>
+          <w:color w:val="1F1F23"/>
+          <w:sz w:val="24"/>
+        </w:rPr>
+        <w:t>6.1 L'organisation de la campagne</w:t>
+      </w:r>
+    </w:p>
+    <w:p>
+      <w:pPr>
+        <w:spacing w:before="0" w:after="160"/>
+        <w:jc w:val="left"/>
+      </w:pPr>
+      <w:r>
+        <w:rPr>
+          <w:b w:val="0"/>
+          <w:i w:val="0"/>
+          <w:sz w:val="22"/>
+        </w:rPr>
+        <w:t>Les tests sont rangés par nature plutôt que par écran : une règle de prix ne se vérifie pas comme une mise en page. La commande « flutter test » exécute l'ensemble en sept secondes, ce qui permet de la lancer après chaque modification plutôt qu'à la veille de la remise.</w:t>
+      </w:r>
+    </w:p>
+    <w:tbl>
+      <w:tblPr>
+        <w:tblStyle w:val="TableGrid"/>
+        <w:tblW w:type="auto" w:w="0"/>
+        <w:tblLook w:firstColumn="1" w:firstRow="1" w:lastColumn="0" w:lastRow="0" w:noHBand="0" w:noVBand="1" w:val="04A0"/>
+      </w:tblPr>
+      <w:tblGrid>
+        <w:gridCol w:w="3137"/>
+        <w:gridCol w:w="3137"/>
+        <w:gridCol w:w="3137"/>
+      </w:tblGrid>
+      <w:tr>
+        <w:tc>
+          <w:tcPr>
+            <w:tcW w:type="dxa" w:w="3137"/>
+          </w:tcPr>
+          <w:p>
+            <w:pPr>
+              <w:shd w:val="clear" w:color="auto" w:fill="F2F2F2"/>
+            </w:pPr>
+            <w:r/>
+            <w:r>
+              <w:rPr>
+                <w:b/>
+                <w:sz w:val="20"/>
+              </w:rPr>
+              <w:t>Fichier</w:t>
+            </w:r>
+          </w:p>
+        </w:tc>
+        <w:tc>
+          <w:tcPr>
+            <w:tcW w:type="dxa" w:w="3137"/>
+          </w:tcPr>
+          <w:p>
+            <w:pPr>
+              <w:shd w:val="clear" w:color="auto" w:fill="F2F2F2"/>
+            </w:pPr>
+            <w:r/>
+            <w:r>
+              <w:rPr>
+                <w:b/>
+                <w:sz w:val="20"/>
+              </w:rPr>
+              <w:t>Nature</w:t>
+            </w:r>
+          </w:p>
+        </w:tc>
+        <w:tc>
+          <w:tcPr>
+            <w:tcW w:type="dxa" w:w="3137"/>
+          </w:tcPr>
+          <w:p>
+            <w:pPr>
+              <w:shd w:val="clear" w:color="auto" w:fill="F2F2F2"/>
+            </w:pPr>
+            <w:r/>
+            <w:r>
+              <w:rPr>
+                <w:b/>
+                <w:sz w:val="20"/>
+              </w:rPr>
+              <w:t>Ce qu'il vérifie</w:t>
+            </w:r>
+          </w:p>
+        </w:tc>
+      </w:tr>
+      <w:tr>
+        <w:tc>
+          <w:tcPr>
+            <w:tcW w:type="dxa" w:w="3137"/>
+          </w:tcPr>
+          <w:p>
+            <w:r/>
+            <w:r>
+              <w:rPr>
+                <w:sz w:val="20"/>
+              </w:rPr>
+              <w:t>regles_metier_test.dart</w:t>
+            </w:r>
+          </w:p>
+        </w:tc>
+        <w:tc>
+          <w:tcPr>
+            <w:tcW w:type="dxa" w:w="3137"/>
+          </w:tcPr>
+          <w:p>
+            <w:r/>
+            <w:r>
+              <w:rPr>
+                <w:sz w:val="20"/>
+              </w:rPr>
+              <w:t>Unitaire</w:t>
+            </w:r>
+          </w:p>
+        </w:tc>
+        <w:tc>
+          <w:tcPr>
+            <w:tcW w:type="dxa" w:w="3137"/>
+          </w:tcPr>
+          <w:p>
+            <w:r/>
+            <w:r>
+              <w:rPr>
+                <w:sz w:val="20"/>
+              </w:rPr>
+              <w:t>Tarif de gros, livraison, codes promotionnels, réduction affichée, expiration d'une offre</w:t>
+            </w:r>
+          </w:p>
+        </w:tc>
+      </w:tr>
+      <w:tr>
+        <w:tc>
+          <w:tcPr>
+            <w:tcW w:type="dxa" w:w="3137"/>
+          </w:tcPr>
+          <w:p>
+            <w:r/>
+            <w:r>
+              <w:rPr>
+                <w:sz w:val="20"/>
+              </w:rPr>
+              <w:t>panier_test.dart</w:t>
+            </w:r>
+          </w:p>
+        </w:tc>
+        <w:tc>
+          <w:tcPr>
+            <w:tcW w:type="dxa" w:w="3137"/>
+          </w:tcPr>
+          <w:p>
+            <w:r/>
+            <w:r>
+              <w:rPr>
+                <w:sz w:val="20"/>
+              </w:rPr>
+              <w:t>Unitaire</w:t>
+            </w:r>
+          </w:p>
+        </w:tc>
+        <w:tc>
+          <w:tcPr>
+            <w:tcW w:type="dxa" w:w="3137"/>
+          </w:tcPr>
+          <w:p>
+            <w:r/>
+            <w:r>
+              <w:rPr>
+                <w:sz w:val="20"/>
+              </w:rPr>
+              <w:t>Contenu du panier : cumul des quantités, retrait d'une ligne, panier vidé</w:t>
+            </w:r>
+          </w:p>
+        </w:tc>
+      </w:tr>
+      <w:tr>
+        <w:tc>
+          <w:tcPr>
+            <w:tcW w:type="dxa" w:w="3137"/>
+          </w:tcPr>
+          <w:p>
+            <w:r/>
+            <w:r>
+              <w:rPr>
+                <w:sz w:val="20"/>
+              </w:rPr>
+              <w:t>distance_test.dart</w:t>
+            </w:r>
+          </w:p>
+        </w:tc>
+        <w:tc>
+          <w:tcPr>
+            <w:tcW w:type="dxa" w:w="3137"/>
+          </w:tcPr>
+          <w:p>
+            <w:r/>
+            <w:r>
+              <w:rPr>
+                <w:sz w:val="20"/>
+              </w:rPr>
+              <w:t>Unitaire</w:t>
+            </w:r>
+          </w:p>
+        </w:tc>
+        <w:tc>
+          <w:tcPr>
+            <w:tcW w:type="dxa" w:w="3137"/>
+          </w:tcPr>
+          <w:p>
+            <w:r/>
+            <w:r>
+              <w:rPr>
+                <w:sz w:val="20"/>
+              </w:rPr>
+              <w:t>Formule de Haversine et mise en forme des distances, sur des trajets connus d'Abidjan</w:t>
+            </w:r>
+          </w:p>
+        </w:tc>
+      </w:tr>
+      <w:tr>
+        <w:tc>
+          <w:tcPr>
+            <w:tcW w:type="dxa" w:w="3137"/>
+          </w:tcPr>
+          <w:p>
+            <w:r/>
+            <w:r>
+              <w:rPr>
+                <w:sz w:val="20"/>
+              </w:rPr>
+              <w:t>formats_test.dart</w:t>
+            </w:r>
+          </w:p>
+        </w:tc>
+        <w:tc>
+          <w:tcPr>
+            <w:tcW w:type="dxa" w:w="3137"/>
+          </w:tcPr>
+          <w:p>
+            <w:r/>
+            <w:r>
+              <w:rPr>
+                <w:sz w:val="20"/>
+              </w:rPr>
+              <w:t>Unitaire</w:t>
+            </w:r>
+          </w:p>
+        </w:tc>
+        <w:tc>
+          <w:tcPr>
+            <w:tcW w:type="dxa" w:w="3137"/>
+          </w:tcPr>
+          <w:p>
+            <w:r/>
+            <w:r>
+              <w:rPr>
+                <w:sz w:val="20"/>
+              </w:rPr>
+              <w:t>Prix, notes et compteurs abrégés, dont l'espace insécable avant la devise</w:t>
+            </w:r>
+          </w:p>
+        </w:tc>
+      </w:tr>
+      <w:tr>
+        <w:tc>
+          <w:tcPr>
+            <w:tcW w:type="dxa" w:w="3137"/>
+          </w:tcPr>
+          <w:p>
+            <w:r/>
+            <w:r>
+              <w:rPr>
+                <w:sz w:val="20"/>
+              </w:rPr>
+              <w:t>depots_test.dart</w:t>
+            </w:r>
+          </w:p>
+        </w:tc>
+        <w:tc>
+          <w:tcPr>
+            <w:tcW w:type="dxa" w:w="3137"/>
+          </w:tcPr>
+          <w:p>
+            <w:r/>
+            <w:r>
+              <w:rPr>
+                <w:sz w:val="20"/>
+              </w:rPr>
+              <w:t>Intégration</w:t>
+            </w:r>
+          </w:p>
+        </w:tc>
+        <w:tc>
+          <w:tcPr>
+            <w:tcW w:type="dxa" w:w="3137"/>
+          </w:tcPr>
+          <w:p>
+            <w:r/>
+            <w:r>
+              <w:rPr>
+                <w:sz w:val="20"/>
+              </w:rPr>
+              <w:t>Comportement des dépôts par doublure : base vide, base injoignable, repli sur le jeu local</w:t>
+            </w:r>
+          </w:p>
+        </w:tc>
+      </w:tr>
+      <w:tr>
+        <w:tc>
+          <w:tcPr>
+            <w:tcW w:type="dxa" w:w="3137"/>
+          </w:tcPr>
+          <w:p>
+            <w:r/>
+            <w:r>
+              <w:rPr>
+                <w:sz w:val="20"/>
+              </w:rPr>
+              <w:t>ressources_test.dart</w:t>
+            </w:r>
+          </w:p>
+        </w:tc>
+        <w:tc>
+          <w:tcPr>
+            <w:tcW w:type="dxa" w:w="3137"/>
+          </w:tcPr>
+          <w:p>
+            <w:r/>
+            <w:r>
+              <w:rPr>
+                <w:sz w:val="20"/>
+              </w:rPr>
+              <w:t>Ressources</w:t>
+            </w:r>
+          </w:p>
+        </w:tc>
+        <w:tc>
+          <w:tcPr>
+            <w:tcW w:type="dxa" w:w="3137"/>
+          </w:tcPr>
+          <w:p>
+            <w:r/>
+            <w:r>
+              <w:rPr>
+                <w:sz w:val="20"/>
+              </w:rPr>
+              <w:t>Chaque image citée par le catalogue existe, est déclarée au manifeste et tient dans un poids raisonnable</w:t>
+            </w:r>
+          </w:p>
+        </w:tc>
+      </w:tr>
+      <w:tr>
+        <w:tc>
+          <w:tcPr>
+            <w:tcW w:type="dxa" w:w="3137"/>
+          </w:tcPr>
+          <w:p>
+            <w:r/>
+            <w:r>
+              <w:rPr>
+                <w:sz w:val="20"/>
+              </w:rPr>
+              <w:t>debordements_test.dart</w:t>
+            </w:r>
+          </w:p>
+        </w:tc>
+        <w:tc>
+          <w:tcPr>
+            <w:tcW w:type="dxa" w:w="3137"/>
+          </w:tcPr>
+          <w:p>
+            <w:r/>
+            <w:r>
+              <w:rPr>
+                <w:sz w:val="20"/>
+              </w:rPr>
+              <w:t>Interface</w:t>
+            </w:r>
+          </w:p>
+        </w:tc>
+        <w:tc>
+          <w:tcPr>
+            <w:tcW w:type="dxa" w:w="3137"/>
+          </w:tcPr>
+          <w:p>
+            <w:r/>
+            <w:r>
+              <w:rPr>
+                <w:sz w:val="20"/>
+              </w:rPr>
+              <w:t>Les écrans tiennent sans débordement sur trois tailles, de 320 × 568 à 412 × 915</w:t>
+            </w:r>
+          </w:p>
+        </w:tc>
+      </w:tr>
+    </w:tbl>
+    <w:p/>
+    <w:p>
+      <w:pPr>
+        <w:spacing w:before="0" w:after="160"/>
+        <w:jc w:val="left"/>
+      </w:pPr>
+      <w:r>
+        <w:rPr>
+          <w:b w:val="0"/>
+          <w:i w:val="0"/>
+          <w:sz w:val="22"/>
+        </w:rPr>
+        <w:t>Deux enseignements sont sortis de cette campagne. Le premier tient aux ressources : déclarer un dossier dans « pubspec.yaml » ne couvre pas ses sous-dossiers, et l'oubli ne produit aucune erreur à la compilation, l'image restant simplement vide à l'exécution. Le test des ressources a relevé plusieurs images dans ce cas, qu'aucune relecture du code n'aurait signalées.</w:t>
+      </w:r>
+    </w:p>
+    <w:p>
+      <w:pPr>
+        <w:spacing w:before="0" w:after="200"/>
+        <w:jc w:val="left"/>
+      </w:pPr>
+      <w:r>
+        <w:rPr>
+          <w:b w:val="0"/>
+          <w:i w:val="0"/>
+          <w:sz w:val="22"/>
+        </w:rPr>
+        <w:t>Le second tient aux dépôts. Un contrôleur ne va jamais chercher sa source de données, il la reçoit à la construction : le test lui confie donc un dépôt de remplacement qui simule une base vide ou muette, sans qu'une seule ligne de sa logique ait à changer. C'est l'architecture décrite au chapitre 2 qui rend ces tests possibles, et c'est la meilleure justification que j'en aie trouvée.</w:t>
+      </w:r>
+    </w:p>
+    <w:p>
+      <w:pPr>
         <w:spacing w:before="360" w:after="160"/>
         <w:jc w:val="left"/>
       </w:pPr>
@@ -3042,7 +3512,730 @@
           <w:color w:val="C00000"/>
           <w:sz w:val="32"/>
         </w:rPr>
-        <w:t>9. Conclusion</w:t>
+        <w:t>9. La documentation du projet</w:t>
+      </w:r>
+    </w:p>
+    <w:p>
+      <w:pPr>
+        <w:spacing w:before="0" w:after="200"/>
+        <w:jc w:val="left"/>
+      </w:pPr>
+      <w:r>
+        <w:rPr>
+          <w:b w:val="0"/>
+          <w:i w:val="0"/>
+          <w:sz w:val="22"/>
+        </w:rPr>
+        <w:t>Un projet qu'on est seul à comprendre est un projet perdu dès qu'on s'en éloigne quelques semaines. J'ai donc traité la documentation comme une partie du travail, et non comme une formalité de fin de parcours. Elle tient sur trois supports, qui ne s'adressent pas au même lecteur.</w:t>
+      </w:r>
+    </w:p>
+    <w:p>
+      <w:pPr>
+        <w:spacing w:before="240" w:after="160"/>
+        <w:jc w:val="left"/>
+      </w:pPr>
+      <w:r>
+        <w:rPr>
+          <w:b/>
+          <w:i w:val="0"/>
+          <w:color w:val="1F1F23"/>
+          <w:sz w:val="24"/>
+        </w:rPr>
+        <w:t>9.1 Le fichier README</w:t>
+      </w:r>
+    </w:p>
+    <w:p>
+      <w:pPr>
+        <w:spacing w:before="0" w:after="160"/>
+        <w:jc w:val="left"/>
+      </w:pPr>
+      <w:r>
+        <w:rPr>
+          <w:b w:val="0"/>
+          <w:i w:val="0"/>
+          <w:sz w:val="22"/>
+        </w:rPr>
+        <w:t>C'est la porte d'entrée du dépôt. Il ne récite pas la liste des écrans : il explique d'abord le problème auquel l'application répond, puis les trois contraintes qui ont commandé presque toutes les décisions techniques, le statut informel qui ne doit rien bloquer, la proximité comme moteur de découverte, et le réseau instable.</w:t>
+      </w:r>
+    </w:p>
+    <w:p>
+      <w:pPr>
+        <w:spacing w:before="0" w:after="120"/>
+        <w:jc w:val="left"/>
+      </w:pPr>
+      <w:r>
+        <w:rPr>
+          <w:b/>
+          <w:i w:val="0"/>
+          <w:sz w:val="22"/>
+        </w:rPr>
+        <w:t>Il se lit en neuf parties :</w:t>
+      </w:r>
+    </w:p>
+    <w:p>
+      <w:pPr>
+        <w:pStyle w:val="ListBullet"/>
+        <w:spacing w:after="80"/>
+      </w:pPr>
+      <w:r>
+        <w:rPr>
+          <w:b/>
+          <w:sz w:val="22"/>
+        </w:rPr>
+        <w:t>Le problème</w:t>
+      </w:r>
+      <w:r>
+        <w:rPr>
+          <w:sz w:val="22"/>
+        </w:rPr>
+        <w:t>, le commerce informel du matériel informatique à Abidjan et ce que les places de marché existantes supposent à tort.</w:t>
+      </w:r>
+    </w:p>
+    <w:p>
+      <w:pPr>
+        <w:pStyle w:val="ListBullet"/>
+        <w:spacing w:after="80"/>
+      </w:pPr>
+      <w:r>
+        <w:rPr>
+          <w:b/>
+          <w:sz w:val="22"/>
+        </w:rPr>
+        <w:t>Les fonctions</w:t>
+      </w:r>
+      <w:r>
+        <w:rPr>
+          <w:sz w:val="22"/>
+        </w:rPr>
+        <w:t>, décrites avec leurs valeurs réelles : seuils de livraison, tri par proximité, double tarif.</w:t>
+      </w:r>
+    </w:p>
+    <w:p>
+      <w:pPr>
+        <w:pStyle w:val="ListBullet"/>
+        <w:spacing w:after="80"/>
+      </w:pPr>
+      <w:r>
+        <w:rPr>
+          <w:b/>
+          <w:sz w:val="22"/>
+        </w:rPr>
+        <w:t>Les décisions techniques</w:t>
+      </w:r>
+      <w:r>
+        <w:rPr>
+          <w:sz w:val="22"/>
+        </w:rPr>
+        <w:t>, chacune avec sa raison, y compris celles qui s'écartent du dossier de conception.</w:t>
+      </w:r>
+    </w:p>
+    <w:p>
+      <w:pPr>
+        <w:pStyle w:val="ListBullet"/>
+        <w:spacing w:after="80"/>
+      </w:pPr>
+      <w:r>
+        <w:rPr>
+          <w:b/>
+          <w:sz w:val="22"/>
+        </w:rPr>
+        <w:t>L'organisation du code</w:t>
+      </w:r>
+      <w:r>
+        <w:rPr>
+          <w:sz w:val="22"/>
+        </w:rPr>
+        <w:t>, l'arborescence de « lib/ » commentée couche par couche.</w:t>
+      </w:r>
+    </w:p>
+    <w:p>
+      <w:pPr>
+        <w:pStyle w:val="ListBullet"/>
+        <w:spacing w:after="80"/>
+      </w:pPr>
+      <w:r>
+        <w:rPr>
+          <w:b/>
+          <w:sz w:val="22"/>
+        </w:rPr>
+        <w:t>Les tests</w:t>
+      </w:r>
+      <w:r>
+        <w:rPr>
+          <w:sz w:val="22"/>
+        </w:rPr>
+        <w:t>, le tableau des sept fichiers et ce que chacun couvre.</w:t>
+      </w:r>
+    </w:p>
+    <w:p>
+      <w:pPr>
+        <w:pStyle w:val="ListBullet"/>
+        <w:spacing w:after="80"/>
+      </w:pPr>
+      <w:r>
+        <w:rPr>
+          <w:b/>
+          <w:sz w:val="22"/>
+        </w:rPr>
+        <w:t>L'outillage</w:t>
+      </w:r>
+      <w:r>
+        <w:rPr>
+          <w:sz w:val="22"/>
+        </w:rPr>
+        <w:t>, les cinq scripts Python de « tool/ » et leur rôle.</w:t>
+      </w:r>
+    </w:p>
+    <w:p>
+      <w:pPr>
+        <w:pStyle w:val="ListBullet"/>
+        <w:spacing w:after="80"/>
+      </w:pPr>
+      <w:r>
+        <w:rPr>
+          <w:b/>
+          <w:sz w:val="22"/>
+        </w:rPr>
+        <w:t>L'installation</w:t>
+      </w:r>
+      <w:r>
+        <w:rPr>
+          <w:sz w:val="22"/>
+        </w:rPr>
+        <w:t>, les deux commandes qui suffisent à lancer l'application, et la marche à suivre pour la brancher sur Firebase.</w:t>
+      </w:r>
+    </w:p>
+    <w:p>
+      <w:pPr>
+        <w:pStyle w:val="ListBullet"/>
+        <w:spacing w:after="80"/>
+      </w:pPr>
+      <w:r>
+        <w:rPr>
+          <w:b/>
+          <w:sz w:val="22"/>
+        </w:rPr>
+        <w:t>Les limites connues</w:t>
+      </w:r>
+      <w:r>
+        <w:rPr>
+          <w:sz w:val="22"/>
+        </w:rPr>
+        <w:t>, énoncées sans les atténuer : codes promotionnels vérifiés sur l'appareil, livraison forfaitaire, paiement non implémenté, règles de sécurité encore en mode test.</w:t>
+      </w:r>
+    </w:p>
+    <w:p>
+      <w:pPr>
+        <w:pStyle w:val="ListBullet"/>
+        <w:spacing w:after="80"/>
+      </w:pPr>
+      <w:r>
+        <w:rPr>
+          <w:b/>
+          <w:sz w:val="22"/>
+        </w:rPr>
+        <w:t>Les crédits</w:t>
+      </w:r>
+      <w:r>
+        <w:rPr>
+          <w:sz w:val="22"/>
+        </w:rPr>
+        <w:t>, licences des polices et du fond cartographique.</w:t>
+      </w:r>
+    </w:p>
+    <w:p>
+      <w:pPr>
+        <w:spacing w:before="0" w:after="200"/>
+        <w:jc w:val="left"/>
+      </w:pPr>
+      <w:r>
+        <w:rPr>
+          <w:b w:val="0"/>
+          <w:i w:val="0"/>
+          <w:sz w:val="22"/>
+        </w:rPr>
+        <w:t>La partie qui m'a demandé le plus de réflexion est celle des limites connues. La tentation est de n'écrire que ce qui fonctionne ; mais un lecteur qui découvre seul qu'un code promotionnel se contourne depuis l'appareil perd confiance dans tout le reste du document. Énoncer la limite, avec la raison et la suite prévue, vaut mieux que la laisser trouver.</w:t>
+      </w:r>
+    </w:p>
+    <w:p>
+      <w:pPr>
+        <w:spacing w:before="240" w:after="160"/>
+        <w:jc w:val="left"/>
+      </w:pPr>
+      <w:r>
+        <w:rPr>
+          <w:b/>
+          <w:i w:val="0"/>
+          <w:color w:val="1F1F23"/>
+          <w:sz w:val="24"/>
+        </w:rPr>
+        <w:t>9.2 La documentation dans le code</w:t>
+      </w:r>
+    </w:p>
+    <w:p>
+      <w:pPr>
+        <w:spacing w:before="0" w:after="160"/>
+        <w:jc w:val="left"/>
+      </w:pPr>
+      <w:r>
+        <w:rPr>
+          <w:b w:val="0"/>
+          <w:i w:val="0"/>
+          <w:sz w:val="22"/>
+        </w:rPr>
+        <w:t>Les commentaires du projet ne redisent pas ce que le code fait déjà lire : ils expliquent pourquoi il fait ainsi. Chaque contrôleur porte en tête la règle du cahier des charges dont il a la charge. Le contrôleur de localisation rappelle qu'un refus de géolocalisation n'interrompt jamais le parcours ; celui du panier, que le prix d'une ligne est recalculé par le modèle et non par lui ; le service Firebase, pourquoi son initialisation est volontairement tolérante.</w:t>
+      </w:r>
+    </w:p>
+    <w:p>
+      <w:pPr>
+        <w:spacing w:before="0" w:after="200"/>
+        <w:jc w:val="left"/>
+      </w:pPr>
+      <w:r>
+        <w:rPr>
+          <w:b w:val="0"/>
+          <w:i w:val="0"/>
+          <w:sz w:val="22"/>
+        </w:rPr>
+        <w:t>Les écarts assumés sont documentés à l'endroit où ils s'appliquent, et non renvoyés à une annexe. Le passage de Socket.io aux flux de Firestore est expliqué en tête du contrôleur de conversation, là où un lecteur se posera la question.</w:t>
+      </w:r>
+    </w:p>
+    <w:p>
+      <w:pPr>
+        <w:spacing w:before="240" w:after="160"/>
+        <w:jc w:val="left"/>
+      </w:pPr>
+      <w:r>
+        <w:rPr>
+          <w:b/>
+          <w:i w:val="0"/>
+          <w:color w:val="1F1F23"/>
+          <w:sz w:val="24"/>
+        </w:rPr>
+        <w:t>9.3 Le rapport, engendré par script</w:t>
+      </w:r>
+    </w:p>
+    <w:p>
+      <w:pPr>
+        <w:spacing w:before="0" w:after="200"/>
+        <w:jc w:val="left"/>
+      </w:pPr>
+      <w:r>
+        <w:rPr>
+          <w:b w:val="0"/>
+          <w:i w:val="0"/>
+          <w:sz w:val="22"/>
+        </w:rPr>
+        <w:t>Ce rapport n'est pas saisi à la main dans un traitement de texte : il est produit par « tool/rapport_docx.py », qui reconstruit la couverture du gabarit D-CLIC et la met en forme, tandis que « tool/contenu_rapport.py » n'en porte que le texte. La séparation a une raison pratique : une correction de fond se relit sans risquer de déranger une bordure, et le document se régénère à l'identique autant de fois qu'il le faut.</w:t>
+      </w:r>
+    </w:p>
+    <w:p>
+      <w:pPr>
+        <w:spacing w:before="360" w:after="160"/>
+        <w:jc w:val="left"/>
+      </w:pPr>
+      <w:r>
+        <w:rPr>
+          <w:b/>
+          <w:i w:val="0"/>
+          <w:color w:val="C00000"/>
+          <w:sz w:val="32"/>
+        </w:rPr>
+        <w:t>10. L'espace de dépôt</w:t>
+      </w:r>
+    </w:p>
+    <w:p>
+      <w:pPr>
+        <w:spacing w:before="0" w:after="160"/>
+        <w:jc w:val="left"/>
+      </w:pPr>
+      <w:r>
+        <w:rPr>
+          <w:b w:val="0"/>
+          <w:i w:val="0"/>
+          <w:sz w:val="22"/>
+        </w:rPr>
+        <w:t>Le projet est placé sous gestion de version avec Git, sur une branche « main ». Le dépôt réunit le code, les ressources, les captures, l'outillage et ce rapport, soit deux cent soixante-seize fichiers au premier enregistrement.</w:t>
+      </w:r>
+    </w:p>
+    <w:p>
+      <w:pPr>
+        <w:spacing w:before="0" w:after="120"/>
+        <w:jc w:val="left"/>
+      </w:pPr>
+      <w:r>
+        <w:rPr>
+          <w:b/>
+          <w:i w:val="0"/>
+          <w:sz w:val="22"/>
+        </w:rPr>
+        <w:t>Ce que le dépôt ne contient pas, et pourquoi :</w:t>
+      </w:r>
+    </w:p>
+    <w:tbl>
+      <w:tblPr>
+        <w:tblStyle w:val="TableGrid"/>
+        <w:tblW w:type="auto" w:w="0"/>
+        <w:tblLook w:firstColumn="1" w:firstRow="1" w:lastColumn="0" w:lastRow="0" w:noHBand="0" w:noVBand="1" w:val="04A0"/>
+      </w:tblPr>
+      <w:tblGrid>
+        <w:gridCol w:w="4706"/>
+        <w:gridCol w:w="4706"/>
+      </w:tblGrid>
+      <w:tr>
+        <w:tc>
+          <w:tcPr>
+            <w:tcW w:type="dxa" w:w="4706"/>
+          </w:tcPr>
+          <w:p>
+            <w:pPr>
+              <w:shd w:val="clear" w:color="auto" w:fill="F2F2F2"/>
+            </w:pPr>
+            <w:r/>
+            <w:r>
+              <w:rPr>
+                <w:b/>
+                <w:sz w:val="20"/>
+              </w:rPr>
+              <w:t>Écarté du dépôt</w:t>
+            </w:r>
+          </w:p>
+        </w:tc>
+        <w:tc>
+          <w:tcPr>
+            <w:tcW w:type="dxa" w:w="4706"/>
+          </w:tcPr>
+          <w:p>
+            <w:pPr>
+              <w:shd w:val="clear" w:color="auto" w:fill="F2F2F2"/>
+            </w:pPr>
+            <w:r/>
+            <w:r>
+              <w:rPr>
+                <w:b/>
+                <w:sz w:val="20"/>
+              </w:rPr>
+              <w:t>Raison</w:t>
+            </w:r>
+          </w:p>
+        </w:tc>
+      </w:tr>
+      <w:tr>
+        <w:tc>
+          <w:tcPr>
+            <w:tcW w:type="dxa" w:w="4706"/>
+          </w:tcPr>
+          <w:p>
+            <w:r/>
+            <w:r>
+              <w:rPr>
+                <w:sz w:val="20"/>
+              </w:rPr>
+              <w:t>build/, .dart_tool/</w:t>
+            </w:r>
+          </w:p>
+        </w:tc>
+        <w:tc>
+          <w:tcPr>
+            <w:tcW w:type="dxa" w:w="4706"/>
+          </w:tcPr>
+          <w:p>
+            <w:r/>
+            <w:r>
+              <w:rPr>
+                <w:sz w:val="20"/>
+              </w:rPr>
+              <w:t>Produits de compilation : reconstruits par « flutter pub get » et « flutter build », ils pèseraient des centaines de mégaoctets pour rien</w:t>
+            </w:r>
+          </w:p>
+        </w:tc>
+      </w:tr>
+      <w:tr>
+        <w:tc>
+          <w:tcPr>
+            <w:tcW w:type="dxa" w:w="4706"/>
+          </w:tcPr>
+          <w:p>
+            <w:r/>
+            <w:r>
+              <w:rPr>
+                <w:sz w:val="20"/>
+              </w:rPr>
+              <w:t>__pycache__/, *.pyc</w:t>
+            </w:r>
+          </w:p>
+        </w:tc>
+        <w:tc>
+          <w:tcPr>
+            <w:tcW w:type="dxa" w:w="4706"/>
+          </w:tcPr>
+          <w:p>
+            <w:r/>
+            <w:r>
+              <w:rPr>
+                <w:sz w:val="20"/>
+              </w:rPr>
+              <w:t>Cache de l'interpréteur Python, propre à la machine</w:t>
+            </w:r>
+          </w:p>
+        </w:tc>
+      </w:tr>
+      <w:tr>
+        <w:tc>
+          <w:tcPr>
+            <w:tcW w:type="dxa" w:w="4706"/>
+          </w:tcPr>
+          <w:p>
+            <w:r/>
+            <w:r>
+              <w:rPr>
+                <w:sz w:val="20"/>
+              </w:rPr>
+              <w:t>.idea/, *.iml</w:t>
+            </w:r>
+          </w:p>
+        </w:tc>
+        <w:tc>
+          <w:tcPr>
+            <w:tcW w:type="dxa" w:w="4706"/>
+          </w:tcPr>
+          <w:p>
+            <w:r/>
+            <w:r>
+              <w:rPr>
+                <w:sz w:val="20"/>
+              </w:rPr>
+              <w:t>Réglages de l'environnement de développement, personnels</w:t>
+            </w:r>
+          </w:p>
+        </w:tc>
+      </w:tr>
+      <w:tr>
+        <w:tc>
+          <w:tcPr>
+            <w:tcW w:type="dxa" w:w="4706"/>
+          </w:tcPr>
+          <w:p>
+            <w:r/>
+            <w:r>
+              <w:rPr>
+                <w:sz w:val="20"/>
+              </w:rPr>
+              <w:t>~$*.docx, .DS_Store</w:t>
+            </w:r>
+          </w:p>
+        </w:tc>
+        <w:tc>
+          <w:tcPr>
+            <w:tcW w:type="dxa" w:w="4706"/>
+          </w:tcPr>
+          <w:p>
+            <w:r/>
+            <w:r>
+              <w:rPr>
+                <w:sz w:val="20"/>
+              </w:rPr>
+              <w:t>Fichiers temporaires de Word et du système de fichiers</w:t>
+            </w:r>
+          </w:p>
+        </w:tc>
+      </w:tr>
+    </w:tbl>
+    <w:p/>
+    <w:p>
+      <w:pPr>
+        <w:spacing w:before="0" w:after="160"/>
+        <w:jc w:val="left"/>
+      </w:pPr>
+      <w:r>
+        <w:rPr>
+          <w:b w:val="0"/>
+          <w:i w:val="0"/>
+          <w:sz w:val="22"/>
+        </w:rPr>
+        <w:t>Un point mérite d'être signalé plutôt que passé sous silence : le fichier « google-services.json » est suivi par le dépôt. Il est nécessaire pour rebrancher l'application sur Firebase et ne contient pas de secret au sens strict, les clés qu'il porte étant destinées au client. Mais la protection réelle repose alors entièrement sur les règles de sécurité Firestore, aujourd'hui en mode test. Avant tout usage réel, ce sont ces règles qu'il faut durcir, et non le fichier qu'il faut cacher.</w:t>
+      </w:r>
+    </w:p>
+    <w:p>
+      <w:pPr>
+        <w:spacing w:before="0" w:after="200"/>
+        <w:jc w:val="left"/>
+      </w:pPr>
+      <w:r>
+        <w:rPr>
+          <w:b w:val="0"/>
+          <w:i w:val="0"/>
+          <w:sz w:val="22"/>
+        </w:rPr>
+        <w:t>Le message du premier enregistrement décrit le projet plutôt que l'action : architecture, sources de données, fonctions, système de design, tests et outillage. C'est ce qu'un relecteur lira en premier dans l'historique.</w:t>
+      </w:r>
+    </w:p>
+    <w:p>
+      <w:pPr>
+        <w:spacing w:before="360" w:after="160"/>
+        <w:jc w:val="left"/>
+      </w:pPr>
+      <w:r>
+        <w:rPr>
+          <w:b/>
+          <w:i w:val="0"/>
+          <w:color w:val="C00000"/>
+          <w:sz w:val="32"/>
+        </w:rPr>
+        <w:t>11. La présentation du projet</w:t>
+      </w:r>
+    </w:p>
+    <w:p>
+      <w:pPr>
+        <w:spacing w:before="0" w:after="160"/>
+        <w:jc w:val="left"/>
+      </w:pPr>
+      <w:r>
+        <w:rPr>
+          <w:b w:val="0"/>
+          <w:i w:val="0"/>
+          <w:sz w:val="22"/>
+        </w:rPr>
+        <w:t>La démonstration suit le parcours d'un acheteur, de l'ouverture de l'application au panier, sur un appareil réel plutôt que sur un émulateur : un téléphone Android sous la version 15, en 1080 × 2412. Les captures de ce rapport en sont tirées.</w:t>
+      </w:r>
+    </w:p>
+    <w:p>
+      <w:pPr>
+        <w:spacing w:before="0" w:after="120"/>
+        <w:jc w:val="left"/>
+      </w:pPr>
+      <w:r>
+        <w:rPr>
+          <w:b/>
+          <w:i w:val="0"/>
+          <w:sz w:val="22"/>
+        </w:rPr>
+        <w:t>Déroulé retenu :</w:t>
+      </w:r>
+    </w:p>
+    <w:p>
+      <w:pPr>
+        <w:pStyle w:val="ListNumber"/>
+        <w:spacing w:after="80"/>
+      </w:pPr>
+      <w:r>
+        <w:rPr>
+          <w:sz w:val="22"/>
+        </w:rPr>
+        <w:t>Écran d'ouverture et présentation, sur fond noir, où se posent la marque et la promesse.</w:t>
+      </w:r>
+    </w:p>
+    <w:p>
+      <w:pPr>
+        <w:pStyle w:val="ListNumber"/>
+        <w:spacing w:after="80"/>
+      </w:pPr>
+      <w:r>
+        <w:rPr>
+          <w:sz w:val="22"/>
+        </w:rPr>
+        <w:t>Création de compte ou connexion, formulaire volontairement court, sans pièce justificative.</w:t>
+      </w:r>
+    </w:p>
+    <w:p>
+      <w:pPr>
+        <w:pStyle w:val="ListNumber"/>
+        <w:spacing w:after="80"/>
+      </w:pPr>
+      <w:r>
+        <w:rPr>
+          <w:sz w:val="22"/>
+        </w:rPr>
+        <w:t>Autorisation de localisation, puis, si elle est refusée, choix manuel de la commune : c'est le moment où se montre que le parcours ne dépend pas du GPS.</w:t>
+      </w:r>
+    </w:p>
+    <w:p>
+      <w:pPr>
+        <w:pStyle w:val="ListNumber"/>
+        <w:spacing w:after="80"/>
+      </w:pPr>
+      <w:r>
+        <w:rPr>
+          <w:sz w:val="22"/>
+        </w:rPr>
+        <w:t>Accueil ordonné par proximité, catégories, annonces et boutiques.</w:t>
+      </w:r>
+    </w:p>
+    <w:p>
+      <w:pPr>
+        <w:pStyle w:val="ListNumber"/>
+        <w:spacing w:after="80"/>
+      </w:pPr>
+      <w:r>
+        <w:rPr>
+          <w:sz w:val="22"/>
+        </w:rPr>
+        <w:t>Fiche produit : galerie, tarif de détail et tarif de gros, ajout au panier.</w:t>
+      </w:r>
+    </w:p>
+    <w:p>
+      <w:pPr>
+        <w:pStyle w:val="ListNumber"/>
+        <w:spacing w:after="80"/>
+      </w:pPr>
+      <w:r>
+        <w:rPr>
+          <w:sz w:val="22"/>
+        </w:rPr>
+        <w:t>Négociation avec le vendeur : proposition de prix, contre-offre, acceptation.</w:t>
+      </w:r>
+    </w:p>
+    <w:p>
+      <w:pPr>
+        <w:pStyle w:val="ListNumber"/>
+        <w:spacing w:after="80"/>
+      </w:pPr>
+      <w:r>
+        <w:rPr>
+          <w:sz w:val="22"/>
+        </w:rPr>
+        <w:t>Panier : bascule au tarif de gros au franchissement du seuil, code promotionnel, frais de livraison offerts au-delà de 100 000 FCFA.</w:t>
+      </w:r>
+    </w:p>
+    <w:p>
+      <w:pPr>
+        <w:pStyle w:val="ListNumber"/>
+        <w:spacing w:after="80"/>
+      </w:pPr>
+      <w:r>
+        <w:rPr>
+          <w:sz w:val="22"/>
+        </w:rPr>
+        <w:t>Compte : activation de la vente, sans création d'un second compte.</w:t>
+      </w:r>
+    </w:p>
+    <w:p>
+      <w:pPr>
+        <w:spacing w:before="0" w:after="200"/>
+        <w:jc w:val="left"/>
+      </w:pPr>
+      <w:r>
+        <w:rPr>
+          <w:b w:val="0"/>
+          <w:i w:val="0"/>
+          <w:sz w:val="22"/>
+        </w:rPr>
+        <w:t>Une précaution a été prise pour la démonstration elle-même : l'application démarre sur son jeu de données local dès que Firebase n'est pas joignable. Une salle sans réseau, une configuration absente, une coupure au mauvais moment ne peuvent donc pas interrompre la présentation. Ce repli n'est pas un artifice de soutenance, c'est le même mécanisme qui sert le mode dégradé exigé par le cahier des charges.</w:t>
+      </w:r>
+    </w:p>
+    <w:p>
+      <w:pPr>
+        <w:spacing w:before="360" w:after="160"/>
+        <w:jc w:val="left"/>
+      </w:pPr>
+      <w:r>
+        <w:rPr>
+          <w:b/>
+          <w:i w:val="0"/>
+          <w:color w:val="C00000"/>
+          <w:sz w:val="32"/>
+        </w:rPr>
+        <w:t>12. Conclusion</w:t>
       </w:r>
     </w:p>
     <w:p>

</xml_diff>